<commit_message>
Trinity reading: add the owner's own definition (conscious, subconscious, decision; yes, no, fine)
</commit_message>
<xml_diff>
--- a/TRINITY_READING_2026-10-22/00_START_HERE_Trinity_Reading.docx
+++ b/TRINITY_READING_2026-10-22/00_START_HERE_Trinity_Reading.docx
@@ -128,6 +128,18 @@
       </w:pPr>
       <w:r>
         <w:t xml:space="preserve">Wrote the Trinity reading of messages 1-5 (three separate passes: structure, meaning, memory).</w:t>
+      </w:r>
+    </w:p>
+    <w:p>
+      <w:pPr>
+        <w:numPr>
+          <w:ilvl w:val="0"/>
+          <w:numId w:val="1001"/>
+        </w:numPr>
+        <w:pStyle w:val="Compact"/>
+      </w:pPr>
+      <w:r>
+        <w:t xml:space="preserve">Added the owner’s own definition (conscious, subconscious, decision; yes, no, fine), with one personal phrase left out. The owner’s message was cut off, so it may continue.</w:t>
       </w:r>
     </w:p>
     <w:bookmarkEnd w:id="21"/>

</xml_diff>